<commit_message>
feat(v4.3.0): 512KiB resilient chunking, telemetry hooks, preflight advisory fix, and installer permissions
</commit_message>
<xml_diff>
--- a/CLIENT_INSTALLATION_AND_OPERATIONS_GUIDE.docx
+++ b/CLIENT_INSTALLATION_AND_OPERATIONS_GUIDE.docx
@@ -1561,7 +1561,7 @@
         <w:rPr>
           <w:color w:val="1A365D"/>
         </w:rPr>
-        <w:t>5. Configuration Settings Reference (config.json)</w:t>
+        <w:t>5. Detailed Configuration Fields Reference: Required Values &amp; Where to Find Them</w:t>
       </w:r>
     </w:p>
     <w:p>
@@ -1569,7 +1569,7 @@
         <w:rPr>
           <w:rFonts w:ascii="Segoe UI" w:hAnsi="Segoe UI"/>
         </w:rPr>
-        <w:t>Configuration parameters are stored in C:\ProgramData\DatabaseBackupApp\config.json:</w:t>
+        <w:t>Whether deploying via the Graphical Setup Wizard (Setup_DatabaseBackup.exe) or configuring the native PowerShell agent via C:\ProgramData\DatabaseBackupApp\config.json, each user-configurable field requires specific information from your local environment. Use the reference table and step-by-step guidance below to locate and enter every required detail:</w:t>
       </w:r>
     </w:p>
     <w:tbl>
@@ -1580,14 +1580,15 @@
         <w:tblLook w:firstColumn="1" w:firstRow="1" w:lastColumn="0" w:lastRow="0" w:noHBand="0" w:noVBand="1" w:val="04A0"/>
       </w:tblPr>
       <w:tblGrid>
-        <w:gridCol w:w="3312"/>
-        <w:gridCol w:w="3312"/>
-        <w:gridCol w:w="3312"/>
+        <w:gridCol w:w="2484"/>
+        <w:gridCol w:w="2484"/>
+        <w:gridCol w:w="2484"/>
+        <w:gridCol w:w="2484"/>
       </w:tblGrid>
       <w:tr>
         <w:tc>
           <w:tcPr>
-            <w:tcW w:type="dxa" w:w="3168"/>
+            <w:tcW w:type="dxa" w:w="2592"/>
             <w:shd w:fill="1A365D"/>
             <w:tcMar>
               <w:top w:w="100" w:type="dxa"/>
@@ -1607,7 +1608,59 @@
                 <w:color w:val="FFFFFF"/>
                 <w:sz w:val="19"/>
               </w:rPr>
-              <w:t>Parameter</w:t>
+              <w:t>Field / GUI Label</w:t>
+            </w:r>
+          </w:p>
+        </w:tc>
+        <w:tc>
+          <w:tcPr>
+            <w:tcW w:type="dxa" w:w="2304"/>
+            <w:shd w:fill="1A365D"/>
+            <w:tcMar>
+              <w:top w:w="100" w:type="dxa"/>
+              <w:bottom w:w="100" w:type="dxa"/>
+              <w:left w:w="120" w:type="dxa"/>
+              <w:right w:w="120" w:type="dxa"/>
+            </w:tcMar>
+          </w:tcPr>
+          <w:p>
+            <w:pPr>
+              <w:jc w:val="left"/>
+            </w:pPr>
+            <w:r>
+              <w:rPr>
+                <w:rFonts w:ascii="Segoe UI" w:hAnsi="Segoe UI"/>
+                <w:b/>
+                <w:color w:val="FFFFFF"/>
+                <w:sz w:val="19"/>
+              </w:rPr>
+              <w:t>What to Fill (Format)</w:t>
+            </w:r>
+          </w:p>
+        </w:tc>
+        <w:tc>
+          <w:tcPr>
+            <w:tcW w:type="dxa" w:w="3024"/>
+            <w:shd w:fill="1A365D"/>
+            <w:tcMar>
+              <w:top w:w="100" w:type="dxa"/>
+              <w:bottom w:w="100" w:type="dxa"/>
+              <w:left w:w="120" w:type="dxa"/>
+              <w:right w:w="120" w:type="dxa"/>
+            </w:tcMar>
+          </w:tcPr>
+          <w:p>
+            <w:pPr>
+              <w:jc w:val="left"/>
+            </w:pPr>
+            <w:r>
+              <w:rPr>
+                <w:rFonts w:ascii="Segoe UI" w:hAnsi="Segoe UI"/>
+                <w:b/>
+                <w:color w:val="FFFFFF"/>
+                <w:sz w:val="19"/>
+              </w:rPr>
+              <w:t>Where to Get It / How to Find It</w:t>
             </w:r>
           </w:p>
         </w:tc>
@@ -1633,33 +1686,7 @@
                 <w:color w:val="FFFFFF"/>
                 <w:sz w:val="19"/>
               </w:rPr>
-              <w:t>Default Value</w:t>
-            </w:r>
-          </w:p>
-        </w:tc>
-        <w:tc>
-          <w:tcPr>
-            <w:tcW w:type="dxa" w:w="4032"/>
-            <w:shd w:fill="1A365D"/>
-            <w:tcMar>
-              <w:top w:w="100" w:type="dxa"/>
-              <w:bottom w:w="100" w:type="dxa"/>
-              <w:left w:w="120" w:type="dxa"/>
-              <w:right w:w="120" w:type="dxa"/>
-            </w:tcMar>
-          </w:tcPr>
-          <w:p>
-            <w:pPr>
-              <w:jc w:val="left"/>
-            </w:pPr>
-            <w:r>
-              <w:rPr>
-                <w:rFonts w:ascii="Segoe UI" w:hAnsi="Segoe UI"/>
-                <w:b/>
-                <w:color w:val="FFFFFF"/>
-                <w:sz w:val="19"/>
-              </w:rPr>
-              <w:t>Description</w:t>
+              <w:t>Important Notes</w:t>
             </w:r>
           </w:p>
         </w:tc>
@@ -1667,7 +1694,7 @@
       <w:tr>
         <w:tc>
           <w:tcPr>
-            <w:tcW w:type="dxa" w:w="3168"/>
+            <w:tcW w:type="dxa" w:w="2592"/>
             <w:shd w:fill="FFFFFF"/>
             <w:tcMar>
               <w:top w:w="80" w:type="dxa"/>
@@ -1689,7 +1716,79 @@
                 <w:color w:val="2D3748"/>
                 <w:sz w:val="18"/>
               </w:rPr>
-              <w:t>CUSTOMER_SLUG</w:t>
+              <w:t>SQL Server Instance</w:t>
+              <w:br/>
+              <w:t>(SQL_SERVER_INSTANCE)</w:t>
+            </w:r>
+          </w:p>
+        </w:tc>
+        <w:tc>
+          <w:tcPr>
+            <w:tcW w:type="dxa" w:w="2304"/>
+            <w:shd w:fill="FFFFFF"/>
+            <w:tcMar>
+              <w:top w:w="80" w:type="dxa"/>
+              <w:bottom w:w="80" w:type="dxa"/>
+              <w:left w:w="120" w:type="dxa"/>
+              <w:right w:w="120" w:type="dxa"/>
+            </w:tcMar>
+            <w:tcBorders>
+              <w:top w:val="single" w:sz="4" w:space="0" w:color="CBD5E0"/>
+              <w:left w:val="none"/>
+              <w:bottom w:val="single" w:sz="4" w:space="0" w:color="CBD5E0"/>
+              <w:right w:val="none"/>
+            </w:tcBorders>
+          </w:tcPr>
+          <w:p>
+            <w:r>
+              <w:rPr>
+                <w:rFonts w:ascii="Segoe UI" w:hAnsi="Segoe UI"/>
+                <w:color w:val="2D3748"/>
+                <w:sz w:val="18"/>
+              </w:rPr>
+              <w:t>Network hostname or SQL instance name.</w:t>
+              <w:br/>
+              <w:t>Examples:</w:t>
+              <w:br/>
+              <w:t>• localhost</w:t>
+              <w:br/>
+              <w:t>• .\SQLEXPRESS</w:t>
+              <w:br/>
+              <w:t>• SERVER01\SQL2019</w:t>
+              <w:br/>
+              <w:t>• 192.168.1.50</w:t>
+            </w:r>
+          </w:p>
+        </w:tc>
+        <w:tc>
+          <w:tcPr>
+            <w:tcW w:type="dxa" w:w="3024"/>
+            <w:shd w:fill="FFFFFF"/>
+            <w:tcMar>
+              <w:top w:w="80" w:type="dxa"/>
+              <w:bottom w:w="80" w:type="dxa"/>
+              <w:left w:w="120" w:type="dxa"/>
+              <w:right w:w="120" w:type="dxa"/>
+            </w:tcMar>
+            <w:tcBorders>
+              <w:top w:val="single" w:sz="4" w:space="0" w:color="CBD5E0"/>
+              <w:left w:val="none"/>
+              <w:bottom w:val="single" w:sz="4" w:space="0" w:color="CBD5E0"/>
+              <w:right w:val="none"/>
+            </w:tcBorders>
+          </w:tcPr>
+          <w:p>
+            <w:r>
+              <w:rPr>
+                <w:rFonts w:ascii="Segoe UI" w:hAnsi="Segoe UI"/>
+                <w:color w:val="2D3748"/>
+                <w:sz w:val="18"/>
+              </w:rPr>
+              <w:t>1. SSMS Login Dialog: Look at 'Server name:' field.</w:t>
+              <w:br/>
+              <w:t>2. Services.msc: Inspect 'SQL Server (...)' service.</w:t>
+              <w:br/>
+              <w:t>3. CMD: Run 'hostname' command.</w:t>
             </w:r>
           </w:p>
         </w:tc>
@@ -1717,35 +1816,7 @@
                 <w:color w:val="2D3748"/>
                 <w:sz w:val="18"/>
               </w:rPr>
-              <w:t>Provided in bundle</w:t>
-            </w:r>
-          </w:p>
-        </w:tc>
-        <w:tc>
-          <w:tcPr>
-            <w:tcW w:type="dxa" w:w="4032"/>
-            <w:shd w:fill="FFFFFF"/>
-            <w:tcMar>
-              <w:top w:w="80" w:type="dxa"/>
-              <w:bottom w:w="80" w:type="dxa"/>
-              <w:left w:w="120" w:type="dxa"/>
-              <w:right w:w="120" w:type="dxa"/>
-            </w:tcMar>
-            <w:tcBorders>
-              <w:top w:val="single" w:sz="4" w:space="0" w:color="CBD5E0"/>
-              <w:left w:val="none"/>
-              <w:bottom w:val="single" w:sz="4" w:space="0" w:color="CBD5E0"/>
-              <w:right w:val="none"/>
-            </w:tcBorders>
-          </w:tcPr>
-          <w:p>
-            <w:r>
-              <w:rPr>
-                <w:rFonts w:ascii="Segoe UI" w:hAnsi="Segoe UI"/>
-                <w:color w:val="2D3748"/>
-                <w:sz w:val="18"/>
-              </w:rPr>
-              <w:t>Your unique organization identifier for cloud storage routing.</w:t>
+              <w:t>Default instance = 'localhost'. Named instances (e.g. Express) must include backslash (.\SQLEXPRESS).</w:t>
             </w:r>
           </w:p>
         </w:tc>
@@ -1753,7 +1824,7 @@
       <w:tr>
         <w:tc>
           <w:tcPr>
-            <w:tcW w:type="dxa" w:w="3168"/>
+            <w:tcW w:type="dxa" w:w="2592"/>
             <w:shd w:fill="F7FAFC"/>
             <w:tcMar>
               <w:top w:w="80" w:type="dxa"/>
@@ -1775,7 +1846,75 @@
                 <w:color w:val="2D3748"/>
                 <w:sz w:val="18"/>
               </w:rPr>
-              <w:t>BROKER_URL</w:t>
+              <w:t>Target Database(s)</w:t>
+              <w:br/>
+              <w:t>(DATABASE_NAME / TARGET_DATABASES)</w:t>
+            </w:r>
+          </w:p>
+        </w:tc>
+        <w:tc>
+          <w:tcPr>
+            <w:tcW w:type="dxa" w:w="2304"/>
+            <w:shd w:fill="F7FAFC"/>
+            <w:tcMar>
+              <w:top w:w="80" w:type="dxa"/>
+              <w:bottom w:w="80" w:type="dxa"/>
+              <w:left w:w="120" w:type="dxa"/>
+              <w:right w:w="120" w:type="dxa"/>
+            </w:tcMar>
+            <w:tcBorders>
+              <w:top w:val="single" w:sz="4" w:space="0" w:color="CBD5E0"/>
+              <w:left w:val="none"/>
+              <w:bottom w:val="single" w:sz="4" w:space="0" w:color="CBD5E0"/>
+              <w:right w:val="none"/>
+            </w:tcBorders>
+          </w:tcPr>
+          <w:p>
+            <w:r>
+              <w:rPr>
+                <w:rFonts w:ascii="Segoe UI" w:hAnsi="Segoe UI"/>
+                <w:color w:val="2D3748"/>
+                <w:sz w:val="18"/>
+              </w:rPr>
+              <w:t>Exact name(s) of the database to protect.</w:t>
+              <w:br/>
+              <w:t>Examples:</w:t>
+              <w:br/>
+              <w:t>• TheDatabase</w:t>
+              <w:br/>
+              <w:t>• GlassSheet, ERP_PROD</w:t>
+            </w:r>
+          </w:p>
+        </w:tc>
+        <w:tc>
+          <w:tcPr>
+            <w:tcW w:type="dxa" w:w="3024"/>
+            <w:shd w:fill="F7FAFC"/>
+            <w:tcMar>
+              <w:top w:w="80" w:type="dxa"/>
+              <w:bottom w:w="80" w:type="dxa"/>
+              <w:left w:w="120" w:type="dxa"/>
+              <w:right w:w="120" w:type="dxa"/>
+            </w:tcMar>
+            <w:tcBorders>
+              <w:top w:val="single" w:sz="4" w:space="0" w:color="CBD5E0"/>
+              <w:left w:val="none"/>
+              <w:bottom w:val="single" w:sz="4" w:space="0" w:color="CBD5E0"/>
+              <w:right w:val="none"/>
+            </w:tcBorders>
+          </w:tcPr>
+          <w:p>
+            <w:r>
+              <w:rPr>
+                <w:rFonts w:ascii="Segoe UI" w:hAnsi="Segoe UI"/>
+                <w:color w:val="2D3748"/>
+                <w:sz w:val="18"/>
+              </w:rPr>
+              <w:t>1. SSMS Object Explorer: Expand 'Databases' folder tree.</w:t>
+              <w:br/>
+              <w:t>2. SQL Query: SELECT name FROM sys.databases WHERE database_id &gt; 4;</w:t>
+              <w:br/>
+              <w:t>3. ERP Software Vendor documentation.</w:t>
             </w:r>
           </w:p>
         </w:tc>
@@ -1803,35 +1942,7 @@
                 <w:color w:val="2D3748"/>
                 <w:sz w:val="18"/>
               </w:rPr>
-              <w:t>Apps Script Web App</w:t>
-            </w:r>
-          </w:p>
-        </w:tc>
-        <w:tc>
-          <w:tcPr>
-            <w:tcW w:type="dxa" w:w="4032"/>
-            <w:shd w:fill="F7FAFC"/>
-            <w:tcMar>
-              <w:top w:w="80" w:type="dxa"/>
-              <w:bottom w:w="80" w:type="dxa"/>
-              <w:left w:w="120" w:type="dxa"/>
-              <w:right w:w="120" w:type="dxa"/>
-            </w:tcMar>
-            <w:tcBorders>
-              <w:top w:val="single" w:sz="4" w:space="0" w:color="CBD5E0"/>
-              <w:left w:val="none"/>
-              <w:bottom w:val="single" w:sz="4" w:space="0" w:color="CBD5E0"/>
-              <w:right w:val="none"/>
-            </w:tcBorders>
-          </w:tcPr>
-          <w:p>
-            <w:r>
-              <w:rPr>
-                <w:rFonts w:ascii="Segoe UI" w:hAnsi="Segoe UI"/>
-                <w:color w:val="2D3748"/>
-                <w:sz w:val="18"/>
-              </w:rPr>
-              <w:t>The HTTPS endpoint of the cloud broker.</w:t>
+              <w:t>Separate multiple databases with commas. Must match exact SQL database name.</w:t>
             </w:r>
           </w:p>
         </w:tc>
@@ -1839,7 +1950,7 @@
       <w:tr>
         <w:tc>
           <w:tcPr>
-            <w:tcW w:type="dxa" w:w="3168"/>
+            <w:tcW w:type="dxa" w:w="2592"/>
             <w:shd w:fill="FFFFFF"/>
             <w:tcMar>
               <w:top w:w="80" w:type="dxa"/>
@@ -1861,7 +1972,73 @@
                 <w:color w:val="2D3748"/>
                 <w:sz w:val="18"/>
               </w:rPr>
-              <w:t>DATABASE_NAME</w:t>
+              <w:t>SQL Authentication</w:t>
+              <w:br/>
+              <w:t>(SQL_USERNAME &amp; SQL_PASSWORD)</w:t>
+            </w:r>
+          </w:p>
+        </w:tc>
+        <w:tc>
+          <w:tcPr>
+            <w:tcW w:type="dxa" w:w="2304"/>
+            <w:shd w:fill="FFFFFF"/>
+            <w:tcMar>
+              <w:top w:w="80" w:type="dxa"/>
+              <w:bottom w:w="80" w:type="dxa"/>
+              <w:left w:w="120" w:type="dxa"/>
+              <w:right w:w="120" w:type="dxa"/>
+            </w:tcMar>
+            <w:tcBorders>
+              <w:top w:val="single" w:sz="4" w:space="0" w:color="CBD5E0"/>
+              <w:left w:val="none"/>
+              <w:bottom w:val="single" w:sz="4" w:space="0" w:color="CBD5E0"/>
+              <w:right w:val="none"/>
+            </w:tcBorders>
+          </w:tcPr>
+          <w:p>
+            <w:r>
+              <w:rPr>
+                <w:rFonts w:ascii="Segoe UI" w:hAnsi="Segoe UI"/>
+                <w:color w:val="2D3748"/>
+                <w:sz w:val="18"/>
+              </w:rPr>
+              <w:t>SQL Login &amp; Password.</w:t>
+              <w:br/>
+              <w:t>Examples:</w:t>
+              <w:br/>
+              <w:t>• Windows Auth: LEAVE BLANK</w:t>
+              <w:br/>
+              <w:t>• SQL Auth: 'sa' or 'backup_svc'</w:t>
+            </w:r>
+          </w:p>
+        </w:tc>
+        <w:tc>
+          <w:tcPr>
+            <w:tcW w:type="dxa" w:w="3024"/>
+            <w:shd w:fill="FFFFFF"/>
+            <w:tcMar>
+              <w:top w:w="80" w:type="dxa"/>
+              <w:bottom w:w="80" w:type="dxa"/>
+              <w:left w:w="120" w:type="dxa"/>
+              <w:right w:w="120" w:type="dxa"/>
+            </w:tcMar>
+            <w:tcBorders>
+              <w:top w:val="single" w:sz="4" w:space="0" w:color="CBD5E0"/>
+              <w:left w:val="none"/>
+              <w:bottom w:val="single" w:sz="4" w:space="0" w:color="CBD5E0"/>
+              <w:right w:val="none"/>
+            </w:tcBorders>
+          </w:tcPr>
+          <w:p>
+            <w:r>
+              <w:rPr>
+                <w:rFonts w:ascii="Segoe UI" w:hAnsi="Segoe UI"/>
+                <w:color w:val="2D3748"/>
+                <w:sz w:val="18"/>
+              </w:rPr>
+              <w:t>Provided by your internal Database Administrator (DBA).</w:t>
+              <w:br/>
+              <w:t>Must possess 'db_backupoperator' and 'db_datareader' (or sysadmin) rights.</w:t>
             </w:r>
           </w:p>
         </w:tc>
@@ -1889,35 +2066,7 @@
                 <w:color w:val="2D3748"/>
                 <w:sz w:val="18"/>
               </w:rPr>
-              <w:t>TheDatabase</w:t>
-            </w:r>
-          </w:p>
-        </w:tc>
-        <w:tc>
-          <w:tcPr>
-            <w:tcW w:type="dxa" w:w="4032"/>
-            <w:shd w:fill="FFFFFF"/>
-            <w:tcMar>
-              <w:top w:w="80" w:type="dxa"/>
-              <w:bottom w:w="80" w:type="dxa"/>
-              <w:left w:w="120" w:type="dxa"/>
-              <w:right w:w="120" w:type="dxa"/>
-            </w:tcMar>
-            <w:tcBorders>
-              <w:top w:val="single" w:sz="4" w:space="0" w:color="CBD5E0"/>
-              <w:left w:val="none"/>
-              <w:bottom w:val="single" w:sz="4" w:space="0" w:color="CBD5E0"/>
-              <w:right w:val="none"/>
-            </w:tcBorders>
-          </w:tcPr>
-          <w:p>
-            <w:r>
-              <w:rPr>
-                <w:rFonts w:ascii="Segoe UI" w:hAnsi="Segoe UI"/>
-                <w:color w:val="2D3748"/>
-                <w:sz w:val="18"/>
-              </w:rPr>
-              <w:t>The target SQL Server database to protect and maintain.</w:t>
+              <w:t>Leaving blank uses Windows Integrated Authentication (-E), recommended for NT AUTHORITY\SYSTEM service accounts.</w:t>
             </w:r>
           </w:p>
         </w:tc>
@@ -1925,7 +2074,7 @@
       <w:tr>
         <w:tc>
           <w:tcPr>
-            <w:tcW w:type="dxa" w:w="3168"/>
+            <w:tcW w:type="dxa" w:w="2592"/>
             <w:shd w:fill="F7FAFC"/>
             <w:tcMar>
               <w:top w:w="80" w:type="dxa"/>
@@ -1947,7 +2096,71 @@
                 <w:color w:val="2D3748"/>
                 <w:sz w:val="18"/>
               </w:rPr>
-              <w:t>SQL_SERVER_INSTANCE</w:t>
+              <w:t>Backup Destination Folder</w:t>
+              <w:br/>
+              <w:t>(BACKUP_FOLDER / BACKUP_FOLDER_PATH)</w:t>
+            </w:r>
+          </w:p>
+        </w:tc>
+        <w:tc>
+          <w:tcPr>
+            <w:tcW w:type="dxa" w:w="2304"/>
+            <w:shd w:fill="F7FAFC"/>
+            <w:tcMar>
+              <w:top w:w="80" w:type="dxa"/>
+              <w:bottom w:w="80" w:type="dxa"/>
+              <w:left w:w="120" w:type="dxa"/>
+              <w:right w:w="120" w:type="dxa"/>
+            </w:tcMar>
+            <w:tcBorders>
+              <w:top w:val="single" w:sz="4" w:space="0" w:color="CBD5E0"/>
+              <w:left w:val="none"/>
+              <w:bottom w:val="single" w:sz="4" w:space="0" w:color="CBD5E0"/>
+              <w:right w:val="none"/>
+            </w:tcBorders>
+          </w:tcPr>
+          <w:p>
+            <w:r>
+              <w:rPr>
+                <w:rFonts w:ascii="Segoe UI" w:hAnsi="Segoe UI"/>
+                <w:color w:val="2D3748"/>
+                <w:sz w:val="18"/>
+              </w:rPr>
+              <w:t>Full local absolute drive path for staging compressed backups.</w:t>
+              <w:br/>
+              <w:t>Examples:</w:t>
+              <w:br/>
+              <w:t>• C:\SQLBackups</w:t>
+              <w:br/>
+              <w:t>• D:\DatabaseBackups</w:t>
+            </w:r>
+          </w:p>
+        </w:tc>
+        <w:tc>
+          <w:tcPr>
+            <w:tcW w:type="dxa" w:w="3024"/>
+            <w:shd w:fill="F7FAFC"/>
+            <w:tcMar>
+              <w:top w:w="80" w:type="dxa"/>
+              <w:bottom w:w="80" w:type="dxa"/>
+              <w:left w:w="120" w:type="dxa"/>
+              <w:right w:w="120" w:type="dxa"/>
+            </w:tcMar>
+            <w:tcBorders>
+              <w:top w:val="single" w:sz="4" w:space="0" w:color="CBD5E0"/>
+              <w:left w:val="none"/>
+              <w:bottom w:val="single" w:sz="4" w:space="0" w:color="CBD5E0"/>
+              <w:right w:val="none"/>
+            </w:tcBorders>
+          </w:tcPr>
+          <w:p>
+            <w:r>
+              <w:rPr>
+                <w:rFonts w:ascii="Segoe UI" w:hAnsi="Segoe UI"/>
+                <w:color w:val="2D3748"/>
+                <w:sz w:val="18"/>
+              </w:rPr>
+              <w:t>Open Windows File Explorer -&gt; select a local drive with at least 2x the uncompressed database size free -&gt; create a dedicated folder.</w:t>
             </w:r>
           </w:p>
         </w:tc>
@@ -1975,35 +2188,7 @@
                 <w:color w:val="2D3748"/>
                 <w:sz w:val="18"/>
               </w:rPr>
-              <w:t>localhost</w:t>
-            </w:r>
-          </w:p>
-        </w:tc>
-        <w:tc>
-          <w:tcPr>
-            <w:tcW w:type="dxa" w:w="4032"/>
-            <w:shd w:fill="F7FAFC"/>
-            <w:tcMar>
-              <w:top w:w="80" w:type="dxa"/>
-              <w:bottom w:w="80" w:type="dxa"/>
-              <w:left w:w="120" w:type="dxa"/>
-              <w:right w:w="120" w:type="dxa"/>
-            </w:tcMar>
-            <w:tcBorders>
-              <w:top w:val="single" w:sz="4" w:space="0" w:color="CBD5E0"/>
-              <w:left w:val="none"/>
-              <w:bottom w:val="single" w:sz="4" w:space="0" w:color="CBD5E0"/>
-              <w:right w:val="none"/>
-            </w:tcBorders>
-          </w:tcPr>
-          <w:p>
-            <w:r>
-              <w:rPr>
-                <w:rFonts w:ascii="Segoe UI" w:hAnsi="Segoe UI"/>
-                <w:color w:val="2D3748"/>
-                <w:sz w:val="18"/>
-              </w:rPr>
-              <w:t>The SQL Server instance name (e.g., localhost or .\SQLEXPRESS).</w:t>
+              <w:t>CRITICAL RESTRICTION: NEVER use OneDrive, Dropbox, or Google Drive folders. Cloud sync paths are blocked to prevent sync lockups.</w:t>
             </w:r>
           </w:p>
         </w:tc>
@@ -2011,7 +2196,7 @@
       <w:tr>
         <w:tc>
           <w:tcPr>
-            <w:tcW w:type="dxa" w:w="3168"/>
+            <w:tcW w:type="dxa" w:w="2592"/>
             <w:shd w:fill="FFFFFF"/>
             <w:tcMar>
               <w:top w:w="80" w:type="dxa"/>
@@ -2033,7 +2218,71 @@
                 <w:color w:val="2D3748"/>
                 <w:sz w:val="18"/>
               </w:rPr>
-              <w:t>BACKUP_FOLDER</w:t>
+              <w:t>Cloud Broker URL</w:t>
+              <w:br/>
+              <w:t>(BROKER_URL)</w:t>
+            </w:r>
+          </w:p>
+        </w:tc>
+        <w:tc>
+          <w:tcPr>
+            <w:tcW w:type="dxa" w:w="2304"/>
+            <w:shd w:fill="FFFFFF"/>
+            <w:tcMar>
+              <w:top w:w="80" w:type="dxa"/>
+              <w:bottom w:w="80" w:type="dxa"/>
+              <w:left w:w="120" w:type="dxa"/>
+              <w:right w:w="120" w:type="dxa"/>
+            </w:tcMar>
+            <w:tcBorders>
+              <w:top w:val="single" w:sz="4" w:space="0" w:color="CBD5E0"/>
+              <w:left w:val="none"/>
+              <w:bottom w:val="single" w:sz="4" w:space="0" w:color="CBD5E0"/>
+              <w:right w:val="none"/>
+            </w:tcBorders>
+          </w:tcPr>
+          <w:p>
+            <w:r>
+              <w:rPr>
+                <w:rFonts w:ascii="Segoe UI" w:hAnsi="Segoe UI"/>
+                <w:color w:val="2D3748"/>
+                <w:sz w:val="18"/>
+              </w:rPr>
+              <w:t>HTTPS Google Apps Script Web App URL.</w:t>
+              <w:br/>
+              <w:t>Example:</w:t>
+              <w:br/>
+              <w:t>https://script.google.com/macros/s/AKfycb.../exec</w:t>
+            </w:r>
+          </w:p>
+        </w:tc>
+        <w:tc>
+          <w:tcPr>
+            <w:tcW w:type="dxa" w:w="3024"/>
+            <w:shd w:fill="FFFFFF"/>
+            <w:tcMar>
+              <w:top w:w="80" w:type="dxa"/>
+              <w:bottom w:w="80" w:type="dxa"/>
+              <w:left w:w="120" w:type="dxa"/>
+              <w:right w:w="120" w:type="dxa"/>
+            </w:tcMar>
+            <w:tcBorders>
+              <w:top w:val="single" w:sz="4" w:space="0" w:color="CBD5E0"/>
+              <w:left w:val="none"/>
+              <w:bottom w:val="single" w:sz="4" w:space="0" w:color="CBD5E0"/>
+              <w:right w:val="none"/>
+            </w:tcBorders>
+          </w:tcPr>
+          <w:p>
+            <w:r>
+              <w:rPr>
+                <w:rFonts w:ascii="Segoe UI" w:hAnsi="Segoe UI"/>
+                <w:color w:val="2D3748"/>
+                <w:sz w:val="18"/>
+              </w:rPr>
+              <w:t>1. Automatically populated from the signed 'bundle.json' included in your package.</w:t>
+              <w:br/>
+              <w:t>2. Or provided in onboarding documentation from your backup service administrator.</w:t>
             </w:r>
           </w:p>
         </w:tc>
@@ -2061,35 +2310,7 @@
                 <w:color w:val="2D3748"/>
                 <w:sz w:val="18"/>
               </w:rPr>
-              <w:t>C:\SQLBackups</w:t>
-            </w:r>
-          </w:p>
-        </w:tc>
-        <w:tc>
-          <w:tcPr>
-            <w:tcW w:type="dxa" w:w="4032"/>
-            <w:shd w:fill="FFFFFF"/>
-            <w:tcMar>
-              <w:top w:w="80" w:type="dxa"/>
-              <w:bottom w:w="80" w:type="dxa"/>
-              <w:left w:w="120" w:type="dxa"/>
-              <w:right w:w="120" w:type="dxa"/>
-            </w:tcMar>
-            <w:tcBorders>
-              <w:top w:val="single" w:sz="4" w:space="0" w:color="CBD5E0"/>
-              <w:left w:val="none"/>
-              <w:bottom w:val="single" w:sz="4" w:space="0" w:color="CBD5E0"/>
-              <w:right w:val="none"/>
-            </w:tcBorders>
-          </w:tcPr>
-          <w:p>
-            <w:r>
-              <w:rPr>
-                <w:rFonts w:ascii="Segoe UI" w:hAnsi="Segoe UI"/>
-                <w:color w:val="2D3748"/>
-                <w:sz w:val="18"/>
-              </w:rPr>
-              <w:t>Local temporary staging folder for database dumps.</w:t>
+              <w:t>Read-only in standard customer deployments; verified against Admin Ed25519 digital signature.</w:t>
             </w:r>
           </w:p>
         </w:tc>
@@ -2097,7 +2318,7 @@
       <w:tr>
         <w:tc>
           <w:tcPr>
-            <w:tcW w:type="dxa" w:w="3168"/>
+            <w:tcW w:type="dxa" w:w="2592"/>
             <w:shd w:fill="F7FAFC"/>
             <w:tcMar>
               <w:top w:w="80" w:type="dxa"/>
@@ -2119,7 +2340,71 @@
                 <w:color w:val="2D3748"/>
                 <w:sz w:val="18"/>
               </w:rPr>
-              <w:t>RETENTION_DAYS</w:t>
+              <w:t>Customer Slug &amp;</w:t>
+              <w:br/>
+              <w:t>Enrollment Token</w:t>
+              <w:br/>
+              <w:t>(CUSTOMER_SLUG / ENROLL_CODE)</w:t>
+            </w:r>
+          </w:p>
+        </w:tc>
+        <w:tc>
+          <w:tcPr>
+            <w:tcW w:type="dxa" w:w="2304"/>
+            <w:shd w:fill="F7FAFC"/>
+            <w:tcMar>
+              <w:top w:w="80" w:type="dxa"/>
+              <w:bottom w:w="80" w:type="dxa"/>
+              <w:left w:w="120" w:type="dxa"/>
+              <w:right w:w="120" w:type="dxa"/>
+            </w:tcMar>
+            <w:tcBorders>
+              <w:top w:val="single" w:sz="4" w:space="0" w:color="CBD5E0"/>
+              <w:left w:val="none"/>
+              <w:bottom w:val="single" w:sz="4" w:space="0" w:color="CBD5E0"/>
+              <w:right w:val="none"/>
+            </w:tcBorders>
+          </w:tcPr>
+          <w:p>
+            <w:r>
+              <w:rPr>
+                <w:rFonts w:ascii="Segoe UI" w:hAnsi="Segoe UI"/>
+                <w:color w:val="2D3748"/>
+                <w:sz w:val="18"/>
+              </w:rPr>
+              <w:t>Customer Slug: lowercase alphanumeric identifier (e.g. 'acme', 'fmi').</w:t>
+              <w:br/>
+              <w:t>Enrollment Code: One-time machine token (e.g. 'ACME@b1357373.corp').</w:t>
+            </w:r>
+          </w:p>
+        </w:tc>
+        <w:tc>
+          <w:tcPr>
+            <w:tcW w:type="dxa" w:w="3024"/>
+            <w:shd w:fill="F7FAFC"/>
+            <w:tcMar>
+              <w:top w:w="80" w:type="dxa"/>
+              <w:bottom w:w="80" w:type="dxa"/>
+              <w:left w:w="120" w:type="dxa"/>
+              <w:right w:w="120" w:type="dxa"/>
+            </w:tcMar>
+            <w:tcBorders>
+              <w:top w:val="single" w:sz="4" w:space="0" w:color="CBD5E0"/>
+              <w:left w:val="none"/>
+              <w:bottom w:val="single" w:sz="4" w:space="0" w:color="CBD5E0"/>
+              <w:right w:val="none"/>
+            </w:tcBorders>
+          </w:tcPr>
+          <w:p>
+            <w:r>
+              <w:rPr>
+                <w:rFonts w:ascii="Segoe UI" w:hAnsi="Segoe UI"/>
+                <w:color w:val="2D3748"/>
+                <w:sz w:val="18"/>
+              </w:rPr>
+              <w:t>1. Automatically imported from package 'bundle.json'.</w:t>
+              <w:br/>
+              <w:t>2. Or listed in Onboarding Credentials sheet Column A/C.</w:t>
             </w:r>
           </w:p>
         </w:tc>
@@ -2147,35 +2432,7 @@
                 <w:color w:val="2D3748"/>
                 <w:sz w:val="18"/>
               </w:rPr>
-              <w:t>30</w:t>
-            </w:r>
-          </w:p>
-        </w:tc>
-        <w:tc>
-          <w:tcPr>
-            <w:tcW w:type="dxa" w:w="4032"/>
-            <w:shd w:fill="F7FAFC"/>
-            <w:tcMar>
-              <w:top w:w="80" w:type="dxa"/>
-              <w:bottom w:w="80" w:type="dxa"/>
-              <w:left w:w="120" w:type="dxa"/>
-              <w:right w:w="120" w:type="dxa"/>
-            </w:tcMar>
-            <w:tcBorders>
-              <w:top w:val="single" w:sz="4" w:space="0" w:color="CBD5E0"/>
-              <w:left w:val="none"/>
-              <w:bottom w:val="single" w:sz="4" w:space="0" w:color="CBD5E0"/>
-              <w:right w:val="none"/>
-            </w:tcBorders>
-          </w:tcPr>
-          <w:p>
-            <w:r>
-              <w:rPr>
-                <w:rFonts w:ascii="Segoe UI" w:hAnsi="Segoe UI"/>
-                <w:color w:val="2D3748"/>
-                <w:sz w:val="18"/>
-              </w:rPr>
-              <w:t>Number of days before local staging backups are purged.</w:t>
+              <w:t>The installer exchanges this code once for a local DPAPI machine-bound token ('token.dpapi'). Never re-entered.</w:t>
             </w:r>
           </w:p>
         </w:tc>
@@ -2183,7 +2440,7 @@
       <w:tr>
         <w:tc>
           <w:tcPr>
-            <w:tcW w:type="dxa" w:w="3168"/>
+            <w:tcW w:type="dxa" w:w="2592"/>
             <w:shd w:fill="FFFFFF"/>
             <w:tcMar>
               <w:top w:w="80" w:type="dxa"/>
@@ -2205,7 +2462,73 @@
                 <w:color w:val="2D3748"/>
                 <w:sz w:val="18"/>
               </w:rPr>
-              <w:t>CLEANUP_THRESHOLD_PERCENT</w:t>
+              <w:t>Automated Backup Schedule</w:t>
+              <w:br/>
+              <w:t>(SCHEDULE_DAYS &amp; SCHEDULE_TIME)</w:t>
+            </w:r>
+          </w:p>
+        </w:tc>
+        <w:tc>
+          <w:tcPr>
+            <w:tcW w:type="dxa" w:w="2304"/>
+            <w:shd w:fill="FFFFFF"/>
+            <w:tcMar>
+              <w:top w:w="80" w:type="dxa"/>
+              <w:bottom w:w="80" w:type="dxa"/>
+              <w:left w:w="120" w:type="dxa"/>
+              <w:right w:w="120" w:type="dxa"/>
+            </w:tcMar>
+            <w:tcBorders>
+              <w:top w:val="single" w:sz="4" w:space="0" w:color="CBD5E0"/>
+              <w:left w:val="none"/>
+              <w:bottom w:val="single" w:sz="4" w:space="0" w:color="CBD5E0"/>
+              <w:right w:val="none"/>
+            </w:tcBorders>
+          </w:tcPr>
+          <w:p>
+            <w:r>
+              <w:rPr>
+                <w:rFonts w:ascii="Segoe UI" w:hAnsi="Segoe UI"/>
+                <w:color w:val="2D3748"/>
+                <w:sz w:val="18"/>
+              </w:rPr>
+              <w:t>Days: MON, WED, FRI or Daily</w:t>
+              <w:br/>
+              <w:t>Time: 24-hour HH:MM format.</w:t>
+              <w:br/>
+              <w:t>Examples:</w:t>
+              <w:br/>
+              <w:t>• Days: MON,TUE,WED,THU,FRI</w:t>
+              <w:br/>
+              <w:t>• Time: 02:00 (2:00 AM)</w:t>
+            </w:r>
+          </w:p>
+        </w:tc>
+        <w:tc>
+          <w:tcPr>
+            <w:tcW w:type="dxa" w:w="3024"/>
+            <w:shd w:fill="FFFFFF"/>
+            <w:tcMar>
+              <w:top w:w="80" w:type="dxa"/>
+              <w:bottom w:w="80" w:type="dxa"/>
+              <w:left w:w="120" w:type="dxa"/>
+              <w:right w:w="120" w:type="dxa"/>
+            </w:tcMar>
+            <w:tcBorders>
+              <w:top w:val="single" w:sz="4" w:space="0" w:color="CBD5E0"/>
+              <w:left w:val="none"/>
+              <w:bottom w:val="single" w:sz="4" w:space="0" w:color="CBD5E0"/>
+              <w:right w:val="none"/>
+            </w:tcBorders>
+          </w:tcPr>
+          <w:p>
+            <w:r>
+              <w:rPr>
+                <w:rFonts w:ascii="Segoe UI" w:hAnsi="Segoe UI"/>
+                <w:color w:val="2D3748"/>
+                <w:sz w:val="18"/>
+              </w:rPr>
+              <w:t>Determined by company IT policy. Schedule during off-peak maintenance hours when active user transactions are lowest.</w:t>
             </w:r>
           </w:p>
         </w:tc>
@@ -2233,35 +2556,7 @@
                 <w:color w:val="2D3748"/>
                 <w:sz w:val="18"/>
               </w:rPr>
-              <w:t>85</w:t>
-            </w:r>
-          </w:p>
-        </w:tc>
-        <w:tc>
-          <w:tcPr>
-            <w:tcW w:type="dxa" w:w="4032"/>
-            <w:shd w:fill="FFFFFF"/>
-            <w:tcMar>
-              <w:top w:w="80" w:type="dxa"/>
-              <w:bottom w:w="80" w:type="dxa"/>
-              <w:left w:w="120" w:type="dxa"/>
-              <w:right w:w="120" w:type="dxa"/>
-            </w:tcMar>
-            <w:tcBorders>
-              <w:top w:val="single" w:sz="4" w:space="0" w:color="CBD5E0"/>
-              <w:left w:val="none"/>
-              <w:bottom w:val="single" w:sz="4" w:space="0" w:color="CBD5E0"/>
-              <w:right w:val="none"/>
-            </w:tcBorders>
-          </w:tcPr>
-          <w:p>
-            <w:r>
-              <w:rPr>
-                <w:rFonts w:ascii="Segoe UI" w:hAnsi="Segoe UI"/>
-                <w:color w:val="2D3748"/>
-                <w:sz w:val="18"/>
-              </w:rPr>
-              <w:t>Disk usage percentage that triggers emergency local staging purge.</w:t>
+              <w:t>Enforced by Windows Task Scheduler ('DatabaseBackup_Daily') with highest privileges (NT AUTHORITY\SYSTEM).</w:t>
             </w:r>
           </w:p>
         </w:tc>
@@ -2269,7 +2564,7 @@
       <w:tr>
         <w:tc>
           <w:tcPr>
-            <w:tcW w:type="dxa" w:w="3168"/>
+            <w:tcW w:type="dxa" w:w="2592"/>
             <w:shd w:fill="F7FAFC"/>
             <w:tcMar>
               <w:top w:w="80" w:type="dxa"/>
@@ -2291,7 +2586,73 @@
                 <w:color w:val="2D3748"/>
                 <w:sz w:val="18"/>
               </w:rPr>
-              <w:t>PERFORMANCE_SCHEDULE_DAY</w:t>
+              <w:t>Local Retention &amp; Cleanup</w:t>
+              <w:br/>
+              <w:t>(RETENTION_DAYS &amp;</w:t>
+              <w:br/>
+              <w:t>CLEANUP_THRESHOLD_PERCENT)</w:t>
+            </w:r>
+          </w:p>
+        </w:tc>
+        <w:tc>
+          <w:tcPr>
+            <w:tcW w:type="dxa" w:w="2304"/>
+            <w:shd w:fill="F7FAFC"/>
+            <w:tcMar>
+              <w:top w:w="80" w:type="dxa"/>
+              <w:bottom w:w="80" w:type="dxa"/>
+              <w:left w:w="120" w:type="dxa"/>
+              <w:right w:w="120" w:type="dxa"/>
+            </w:tcMar>
+            <w:tcBorders>
+              <w:top w:val="single" w:sz="4" w:space="0" w:color="CBD5E0"/>
+              <w:left w:val="none"/>
+              <w:bottom w:val="single" w:sz="4" w:space="0" w:color="CBD5E0"/>
+              <w:right w:val="none"/>
+            </w:tcBorders>
+          </w:tcPr>
+          <w:p>
+            <w:r>
+              <w:rPr>
+                <w:rFonts w:ascii="Segoe UI" w:hAnsi="Segoe UI"/>
+                <w:color w:val="2D3748"/>
+                <w:sz w:val="18"/>
+              </w:rPr>
+              <w:t>Retention: Integer days (e.g. 7 or 30).</w:t>
+              <w:br/>
+              <w:t>Threshold: Integer percent (e.g. 85 or 90).</w:t>
+              <w:br/>
+              <w:t>Default: 30 days, 85% disk limit.</w:t>
+            </w:r>
+          </w:p>
+        </w:tc>
+        <w:tc>
+          <w:tcPr>
+            <w:tcW w:type="dxa" w:w="3024"/>
+            <w:shd w:fill="F7FAFC"/>
+            <w:tcMar>
+              <w:top w:w="80" w:type="dxa"/>
+              <w:bottom w:w="80" w:type="dxa"/>
+              <w:left w:w="120" w:type="dxa"/>
+              <w:right w:w="120" w:type="dxa"/>
+            </w:tcMar>
+            <w:tcBorders>
+              <w:top w:val="single" w:sz="4" w:space="0" w:color="CBD5E0"/>
+              <w:left w:val="none"/>
+              <w:bottom w:val="single" w:sz="4" w:space="0" w:color="CBD5E0"/>
+              <w:right w:val="none"/>
+            </w:tcBorders>
+          </w:tcPr>
+          <w:p>
+            <w:r>
+              <w:rPr>
+                <w:rFonts w:ascii="Segoe UI" w:hAnsi="Segoe UI"/>
+                <w:color w:val="2D3748"/>
+                <w:sz w:val="18"/>
+              </w:rPr>
+              <w:t>Internal company IT retention guidelines.</w:t>
+              <w:br/>
+              <w:t>Pre-configured with industry-standard defaults.</w:t>
             </w:r>
           </w:p>
         </w:tc>
@@ -2319,35 +2680,7 @@
                 <w:color w:val="2D3748"/>
                 <w:sz w:val="18"/>
               </w:rPr>
-              <w:t>Sunday</w:t>
-            </w:r>
-          </w:p>
-        </w:tc>
-        <w:tc>
-          <w:tcPr>
-            <w:tcW w:type="dxa" w:w="4032"/>
-            <w:shd w:fill="F7FAFC"/>
-            <w:tcMar>
-              <w:top w:w="80" w:type="dxa"/>
-              <w:bottom w:w="80" w:type="dxa"/>
-              <w:left w:w="120" w:type="dxa"/>
-              <w:right w:w="120" w:type="dxa"/>
-            </w:tcMar>
-            <w:tcBorders>
-              <w:top w:val="single" w:sz="4" w:space="0" w:color="CBD5E0"/>
-              <w:left w:val="none"/>
-              <w:bottom w:val="single" w:sz="4" w:space="0" w:color="CBD5E0"/>
-              <w:right w:val="none"/>
-            </w:tcBorders>
-          </w:tcPr>
-          <w:p>
-            <w:r>
-              <w:rPr>
-                <w:rFonts w:ascii="Segoe UI" w:hAnsi="Segoe UI"/>
-                <w:color w:val="2D3748"/>
-                <w:sz w:val="18"/>
-              </w:rPr>
-              <w:t>Day of the week for index re-indexing (Daily or Sunday..Saturday).</w:t>
+              <w:t>Module 2 monitors disk space hourly and purges staging backups older than RETENTION_DAYS, or triggers emergency purge if disk exceeds threshold.</w:t>
             </w:r>
           </w:p>
         </w:tc>
@@ -2355,7 +2688,7 @@
       <w:tr>
         <w:tc>
           <w:tcPr>
-            <w:tcW w:type="dxa" w:w="3168"/>
+            <w:tcW w:type="dxa" w:w="2592"/>
             <w:shd w:fill="FFFFFF"/>
             <w:tcMar>
               <w:top w:w="80" w:type="dxa"/>
@@ -2377,7 +2710,71 @@
                 <w:color w:val="2D3748"/>
                 <w:sz w:val="18"/>
               </w:rPr>
-              <w:t>PERFORMANCE_SCHEDULE_TIME</w:t>
+              <w:t>Performance Maintenance</w:t>
+              <w:br/>
+              <w:t>(PERF_FILL_FACTOR &amp;</w:t>
+              <w:br/>
+              <w:t>PERFORMANCE_SCHEDULE_DAY/TIME)</w:t>
+            </w:r>
+          </w:p>
+        </w:tc>
+        <w:tc>
+          <w:tcPr>
+            <w:tcW w:type="dxa" w:w="2304"/>
+            <w:shd w:fill="FFFFFF"/>
+            <w:tcMar>
+              <w:top w:w="80" w:type="dxa"/>
+              <w:bottom w:w="80" w:type="dxa"/>
+              <w:left w:w="120" w:type="dxa"/>
+              <w:right w:w="120" w:type="dxa"/>
+            </w:tcMar>
+            <w:tcBorders>
+              <w:top w:val="single" w:sz="4" w:space="0" w:color="CBD5E0"/>
+              <w:left w:val="none"/>
+              <w:bottom w:val="single" w:sz="4" w:space="0" w:color="CBD5E0"/>
+              <w:right w:val="none"/>
+            </w:tcBorders>
+          </w:tcPr>
+          <w:p>
+            <w:r>
+              <w:rPr>
+                <w:rFonts w:ascii="Segoe UI" w:hAnsi="Segoe UI"/>
+                <w:color w:val="2D3748"/>
+                <w:sz w:val="18"/>
+              </w:rPr>
+              <w:t>FillFactor: Integer 50-100 (Default: 80).</w:t>
+              <w:br/>
+              <w:t>Day: Sunday (or Daily/Weekly).</w:t>
+              <w:br/>
+              <w:t>Time: 03:30 (24h format).</w:t>
+            </w:r>
+          </w:p>
+        </w:tc>
+        <w:tc>
+          <w:tcPr>
+            <w:tcW w:type="dxa" w:w="3024"/>
+            <w:shd w:fill="FFFFFF"/>
+            <w:tcMar>
+              <w:top w:w="80" w:type="dxa"/>
+              <w:bottom w:w="80" w:type="dxa"/>
+              <w:left w:w="120" w:type="dxa"/>
+              <w:right w:w="120" w:type="dxa"/>
+            </w:tcMar>
+            <w:tcBorders>
+              <w:top w:val="single" w:sz="4" w:space="0" w:color="CBD5E0"/>
+              <w:left w:val="none"/>
+              <w:bottom w:val="single" w:sz="4" w:space="0" w:color="CBD5E0"/>
+              <w:right w:val="none"/>
+            </w:tcBorders>
+          </w:tcPr>
+          <w:p>
+            <w:r>
+              <w:rPr>
+                <w:rFonts w:ascii="Segoe UI" w:hAnsi="Segoe UI"/>
+                <w:color w:val="2D3748"/>
+                <w:sz w:val="18"/>
+              </w:rPr>
+              <w:t>Pre-configured to Microsoft recommended standard (80% FillFactor) for index rebuilds and statistics refresh.</w:t>
             </w:r>
           </w:p>
         </w:tc>
@@ -2405,35 +2802,7 @@
                 <w:color w:val="2D3748"/>
                 <w:sz w:val="18"/>
               </w:rPr>
-              <w:t>03:30</w:t>
-            </w:r>
-          </w:p>
-        </w:tc>
-        <w:tc>
-          <w:tcPr>
-            <w:tcW w:type="dxa" w:w="4032"/>
-            <w:shd w:fill="FFFFFF"/>
-            <w:tcMar>
-              <w:top w:w="80" w:type="dxa"/>
-              <w:bottom w:w="80" w:type="dxa"/>
-              <w:left w:w="120" w:type="dxa"/>
-              <w:right w:w="120" w:type="dxa"/>
-            </w:tcMar>
-            <w:tcBorders>
-              <w:top w:val="single" w:sz="4" w:space="0" w:color="CBD5E0"/>
-              <w:left w:val="none"/>
-              <w:bottom w:val="single" w:sz="4" w:space="0" w:color="CBD5E0"/>
-              <w:right w:val="none"/>
-            </w:tcBorders>
-          </w:tcPr>
-          <w:p>
-            <w:r>
-              <w:rPr>
-                <w:rFonts w:ascii="Segoe UI" w:hAnsi="Segoe UI"/>
-                <w:color w:val="2D3748"/>
-                <w:sz w:val="18"/>
-              </w:rPr>
-              <w:t>Fixed time of day (24h format) for index rebuild execution.</w:t>
+              <w:t>Runs pre-maintenance safety backup, DBCC CHECKDB consistency checks, DBCC DBREINDEX, and sp_updatestats.</w:t>
             </w:r>
           </w:p>
         </w:tc>
@@ -2441,7 +2810,129 @@
     </w:tbl>
     <w:p>
       <w:pPr>
-        <w:spacing w:after="200"/>
+        <w:spacing w:after="240"/>
+      </w:pPr>
+    </w:p>
+    <w:tbl>
+      <w:tblPr>
+        <w:tblW w:type="auto" w:w="0"/>
+        <w:jc w:val="center"/>
+        <w:tblLayout w:type="fixed"/>
+        <w:tblLook w:firstColumn="1" w:firstRow="1" w:lastColumn="0" w:lastRow="0" w:noHBand="0" w:noVBand="1" w:val="04A0"/>
+      </w:tblPr>
+      <w:tblGrid>
+        <w:gridCol w:w="9936"/>
+      </w:tblGrid>
+      <w:tr>
+        <w:tc>
+          <w:tcPr>
+            <w:tcW w:type="dxa" w:w="9360"/>
+            <w:shd w:fill="EDF2F7"/>
+            <w:tcMar>
+              <w:top w:w="140" w:type="dxa"/>
+              <w:bottom w:w="140" w:type="dxa"/>
+              <w:left w:w="200" w:type="dxa"/>
+              <w:right w:w="200" w:type="dxa"/>
+            </w:tcMar>
+            <w:tcBorders>
+              <w:top w:val="none"/>
+              <w:left w:val="single" w:sz="36" w:space="0" w:color="2B6CB0"/>
+              <w:bottom w:val="none"/>
+              <w:right w:val="none"/>
+            </w:tcBorders>
+          </w:tcPr>
+          <w:p>
+            <w:pPr>
+              <w:spacing w:before="0" w:after="80"/>
+            </w:pPr>
+            <w:r>
+              <w:rPr>
+                <w:rFonts w:ascii="Segoe UI" w:hAnsi="Segoe UI"/>
+                <w:b/>
+                <w:color w:val="2B6CB0"/>
+                <w:sz w:val="20"/>
+              </w:rPr>
+              <w:t xml:space="preserve">[PRO-TIP: LOCATING YOUR SQL SERVER INSTANCE] </w:t>
+            </w:r>
+            <w:r>
+              <w:rPr>
+                <w:rFonts w:ascii="Segoe UI" w:hAnsi="Segoe UI"/>
+                <w:color w:val="2D3748"/>
+                <w:sz w:val="19"/>
+              </w:rPr>
+              <w:t>HOW TO SAFELY LOCATE YOUR SQL INSTANCE NAME IN UNDER 30 SECONDS:</w:t>
+              <w:br/>
+              <w:t>• If SQL Server runs on this same server: Try 'localhost' or '.' first. If using SQL Express edition, use '.\SQLEXPRESS'.</w:t>
+              <w:br/>
+              <w:t>• To verify with 100% certainty: Press Win + R, type 'services.msc', and press Enter. Scroll down to 'SQL Server'. If the service name inside parentheses is 'MSSQLSERVER', your instance is 'localhost'. If it says anything else, such as 'SQL Server (PROD_INSTANCE)', your instance name is '.\PROD_INSTANCE'.</w:t>
+            </w:r>
+          </w:p>
+        </w:tc>
+      </w:tr>
+    </w:tbl>
+    <w:p>
+      <w:pPr>
+        <w:spacing w:after="80"/>
+      </w:pPr>
+    </w:p>
+    <w:tbl>
+      <w:tblPr>
+        <w:tblW w:type="auto" w:w="0"/>
+        <w:jc w:val="center"/>
+        <w:tblLayout w:type="fixed"/>
+        <w:tblLook w:firstColumn="1" w:firstRow="1" w:lastColumn="0" w:lastRow="0" w:noHBand="0" w:noVBand="1" w:val="04A0"/>
+      </w:tblPr>
+      <w:tblGrid>
+        <w:gridCol w:w="9936"/>
+      </w:tblGrid>
+      <w:tr>
+        <w:tc>
+          <w:tcPr>
+            <w:tcW w:type="dxa" w:w="9360"/>
+            <w:shd w:fill="EDF2F7"/>
+            <w:tcMar>
+              <w:top w:w="140" w:type="dxa"/>
+              <w:bottom w:w="140" w:type="dxa"/>
+              <w:left w:w="200" w:type="dxa"/>
+              <w:right w:w="200" w:type="dxa"/>
+            </w:tcMar>
+            <w:tcBorders>
+              <w:top w:val="none"/>
+              <w:left w:val="single" w:sz="36" w:space="0" w:color="2B6CB0"/>
+              <w:bottom w:val="none"/>
+              <w:right w:val="none"/>
+            </w:tcBorders>
+          </w:tcPr>
+          <w:p>
+            <w:pPr>
+              <w:spacing w:before="0" w:after="80"/>
+            </w:pPr>
+            <w:r>
+              <w:rPr>
+                <w:rFonts w:ascii="Segoe UI" w:hAnsi="Segoe UI"/>
+                <w:b/>
+                <w:color w:val="2B6CB0"/>
+                <w:sz w:val="20"/>
+              </w:rPr>
+              <w:t xml:space="preserve">[CRITICAL STORAGE WARNING] </w:t>
+            </w:r>
+            <w:r>
+              <w:rPr>
+                <w:rFonts w:ascii="Segoe UI" w:hAnsi="Segoe UI"/>
+                <w:color w:val="2D3748"/>
+                <w:sz w:val="19"/>
+              </w:rPr>
+              <w:t>ANTI-DATA CORRUPTION WARNING — CLOUD SYNC DIRECTORIES ARE STRICTLY FORBIDDEN:</w:t>
+              <w:br/>
+              <w:t>Do NOT set the local Backup Destination Folder to any path containing 'OneDrive', 'Dropbox', 'Google Drive', or 'iCloud'. Active cloud synchronization engines attempt to lock files during differential write operations, leading to corrupted SQL database dumps and transmission aborts. The installation wizard will automatically reject cloud sync directories.</w:t>
+            </w:r>
+          </w:p>
+        </w:tc>
+      </w:tr>
+    </w:tbl>
+    <w:p>
+      <w:pPr>
+        <w:spacing w:after="80"/>
       </w:pPr>
     </w:p>
     <w:p>

</xml_diff>